<commit_message>
add TOC page break before
</commit_message>
<xml_diff>
--- a/_extensions/trial-report/trial-report.docx
+++ b/_extensions/trial-report/trial-report.docx
@@ -1435,8 +1435,9 @@
     <w:uiPriority w:val="39"/>
     <w:unhideWhenUsed/>
     <w:qFormat/>
-    <w:rsid w:val="002465CC"/>
-    <w:pPr>
+    <w:rsid w:val="005D4621"/>
+    <w:pPr>
+      <w:pageBreakBefore/>
       <w:spacing w:line="259" w:lineRule="auto"/>
       <w:outlineLvl w:val="9"/>
     </w:pPr>

</xml_diff>